<commit_message>
v143: admin dashboard cards fit phones, admin screens open at the top, clearer sign-in code message, manuals 1.3 (print-ready chip card), HANDOVER and CHANGELOG
</commit_message>
<xml_diff>
--- a/docs/manuals/Introthread-Administrator-Guide.docx
+++ b/docs/manuals/Introthread-Administrator-Guide.docx
@@ -171,13 +171,8 @@
             <w:tcW w:type="dxa" w:w="2353"/>
           </w:tcPr>
           <w:p>
-            <w:r/>
             <w:r>
-              <w:rPr>
-                <w:b/>
-                <w:sz w:val="20"/>
-              </w:rPr>
-              <w:t>1.2</w:t>
+              <w:t>1.3</w:t>
             </w:r>
           </w:p>
         </w:tc>
@@ -186,13 +181,8 @@
             <w:tcW w:type="dxa" w:w="2353"/>
           </w:tcPr>
           <w:p>
-            <w:r/>
             <w:r>
-              <w:rPr>
-                <w:b/>
-                <w:sz w:val="20"/>
-              </w:rPr>
-              <w:t>26 October 2026</w:t>
+              <w:t>27 October 2026</w:t>
             </w:r>
           </w:p>
         </w:tc>
@@ -252,13 +242,7 @@
           <w:b/>
           <w:sz w:val="20"/>
         </w:rPr>
-        <w:t>Applies to:</w:t>
-      </w:r>
-      <w:r>
-        <w:rPr>
-          <w:sz w:val="20"/>
-        </w:rPr>
-        <w:t xml:space="preserve"> introthread.com, release v133 (26 October 2026)</w:t>
+        <w:t>Applies to: introthread.com, release v143 (27 October 2026)</w:t>
       </w:r>
     </w:p>
     <w:p>
@@ -555,6 +539,48 @@
                 <w:sz w:val="18"/>
               </w:rPr>
               <w:t>First complete release of the Administrator Guide</w:t>
+            </w:r>
+          </w:p>
+        </w:tc>
+      </w:tr>
+      <w:tr>
+        <w:tc>
+          <w:tcPr>
+            <w:tcW w:type="dxa" w:w="2353"/>
+          </w:tcPr>
+          <w:p>
+            <w:r>
+              <w:t>1.3</w:t>
+            </w:r>
+          </w:p>
+        </w:tc>
+        <w:tc>
+          <w:tcPr>
+            <w:tcW w:type="dxa" w:w="2353"/>
+          </w:tcPr>
+          <w:p>
+            <w:r>
+              <w:t>27 Oct 2026</w:t>
+            </w:r>
+          </w:p>
+        </w:tc>
+        <w:tc>
+          <w:tcPr>
+            <w:tcW w:type="dxa" w:w="2353"/>
+          </w:tcPr>
+          <w:p>
+            <w:r>
+              <w:t>Introthread product team</w:t>
+            </w:r>
+          </w:p>
+        </w:tc>
+        <w:tc>
+          <w:tcPr>
+            <w:tcW w:type="dxa" w:w="2353"/>
+          </w:tcPr>
+          <w:p>
+            <w:r>
+              <w:t>Print-ready card replaces the posted NFC card (v141); chip-card design and live preview (v142); clearer sign-in code message and admin fixes (v143)</w:t>
             </w:r>
           </w:p>
         </w:tc>
@@ -1545,22 +1571,12 @@
         <w:pStyle w:val="Heading1"/>
       </w:pPr>
       <w:r>
-        <w:t>06  NFC card orders</w:t>
+        <w:t>06  Print-ready card orders</w:t>
       </w:r>
     </w:p>
     <w:p>
       <w:r>
-        <w:t xml:space="preserve">Members can order a ready-programmed Introthread NFC card for KES 199. Each paid order is saved (table </w:t>
-      </w:r>
-      <w:r>
-        <w:rPr>
-          <w:rFonts w:ascii="Consolas" w:hAnsi="Consolas" w:eastAsia="Consolas"/>
-          <w:color w:val="233A8C"/>
-        </w:rPr>
-        <w:t>card_orders</w:t>
-      </w:r>
-      <w:r>
-        <w:t>) and emailed to hello@introthread.com with the name and title for the card, phone, delivery address and the card link to program.</w:t>
+        <w:t>Since v141 (26 October 2026) the KES 199 card is print-ready only. Nothing is programmed, printed or posted by staff.</w:t>
       </w:r>
     </w:p>
     <w:p>
@@ -1573,10 +1589,7 @@
           <w:b/>
           <w:color w:val="1F5EFF"/>
         </w:rPr>
-        <w:t xml:space="preserve">1.  </w:t>
-      </w:r>
-      <w:r>
-        <w:t>Open the order email. Program a blank NFC card with the card link shown (it ends in ?src=nfc), for example with the free NFC Tools app: Write, Add a record, URL.</w:t>
+        <w:t>1.  A member enters the name, title and company for the card (with a live preview of the chip-card design, v142) and pays KES 199 through Paystack.</w:t>
       </w:r>
     </w:p>
     <w:p>
@@ -1589,10 +1602,7 @@
           <w:b/>
           <w:color w:val="1F5EFF"/>
         </w:rPr>
-        <w:t xml:space="preserve">2.  </w:t>
-      </w:r>
-      <w:r>
-        <w:t>Print the name and title on the card.</w:t>
+        <w:t>2.  The server saves the order (table card_orders), builds the card PDF and emails it to the buyer as an attachment. When the email is accepted the order status is set to delivered.</w:t>
       </w:r>
     </w:p>
     <w:p>
@@ -1605,10 +1615,7 @@
           <w:b/>
           <w:color w:val="1F5EFF"/>
         </w:rPr>
-        <w:t xml:space="preserve">3.  </w:t>
-      </w:r>
-      <w:r>
-        <w:t>Call the member on the phone number given to arrange delivery.</w:t>
+        <w:t>3.  hello@introthread.com receives a short note: "Printable card sold, nothing to post". No action is needed.</w:t>
       </w:r>
     </w:p>
     <w:p>
@@ -1621,10 +1628,22 @@
           <w:b/>
           <w:color w:val="1F5EFF"/>
         </w:rPr>
-        <w:t xml:space="preserve">4.  </w:t>
+        <w:t>4.  The member can download the PDF again in Tap &gt; Tap with an NFC card.</w:t>
       </w:r>
+    </w:p>
+    <w:p>
       <w:r>
-        <w:t>Update the order status (paid, programmed, shipped, delivered or cancelled) with a reason. Until an admin screen is added, staff with database access use the function admin_card_order_set, which checks the role and writes the audit log.</w:t>
+        <w:t>If a member did not get the PDF: ask them to check spam, then to download it from the NFC panel. If the order is still paid (not delivered), the email failed: check RESEND_API_KEY in Vercel and the Resend dashboard.</w:t>
+      </w:r>
+    </w:p>
+    <w:p>
+      <w:r>
+        <w:t>Refunds and cancellations: staff with database access set the status with the function admin_card_order_set (it checks the role and writes the audit log). Statuses: paid, delivered, cancelled (programmed and shipped remain only for old v133 orders).</w:t>
+      </w:r>
+    </w:p>
+    <w:p>
+      <w:r>
+        <w:t>About the chip: the gold chip on the card is printed artwork. Members who want tapping add their own NFC sticker and write their link to it in the app.</w:t>
       </w:r>
     </w:p>
     <w:p>

</xml_diff>